<commit_message>
edits to cover letter
</commit_message>
<xml_diff>
--- a/Manuscript/Cover_Letter_PLoS_Biology.docx
+++ b/Manuscript/Cover_Letter_PLoS_Biology.docx
@@ -9,28 +9,285 @@
     </w:p>
     <w:p/>
     <w:p>
+      <w:r>
+        <w:t>Please find enclosed our manuscript “</w:t>
+      </w:r>
+      <w:r>
+        <w:rPr>
+          <w:i/>
+        </w:rPr>
+        <w:t>The great tit HapMap project: a continental-scale analysis of genomic variation in a songbird</w:t>
+      </w:r>
+      <w:r>
+        <w:t xml:space="preserve">”, which we hope you will consider for publication in </w:t>
+      </w:r>
+      <w:proofErr w:type="spellStart"/>
+      <w:r>
+        <w:rPr>
+          <w:i/>
+        </w:rPr>
+        <w:t>PLoS</w:t>
+      </w:r>
+      <w:proofErr w:type="spellEnd"/>
+      <w:r>
+        <w:rPr>
+          <w:i/>
+        </w:rPr>
+        <w:t xml:space="preserve"> Biology.</w:t>
+      </w:r>
+      <w:r>
+        <w:rPr>
+          <w:i/>
+        </w:rPr>
+        <w:t xml:space="preserve"> </w:t>
+      </w:r>
+      <w:r>
+        <w:t xml:space="preserve">In this study we </w:t>
+      </w:r>
+      <w:r>
+        <w:t>perform one of the most comprehensive screens of genomic variation of any wild organism to date</w:t>
+      </w:r>
+      <w:r>
+        <w:t>,</w:t>
+      </w:r>
+      <w:r>
+        <w:t xml:space="preserve"> </w:t>
+      </w:r>
+      <w:r>
+        <w:t>showing in unprecedented detail</w:t>
+      </w:r>
+      <w:r>
+        <w:t xml:space="preserve"> how </w:t>
+      </w:r>
+      <w:r>
+        <w:t xml:space="preserve">genomic </w:t>
+      </w:r>
+      <w:r>
+        <w:t>variation</w:t>
+      </w:r>
+      <w:r>
+        <w:t xml:space="preserve"> </w:t>
+      </w:r>
+      <w:r>
+        <w:t>evolves in widespread continental species</w:t>
+      </w:r>
+      <w:r>
+        <w:t>.</w:t>
+      </w:r>
+      <w:r>
+        <w:t xml:space="preserve"> </w:t>
+      </w:r>
+      <w:r>
+        <w:t>In doing so, we</w:t>
+      </w:r>
+      <w:r>
+        <w:t xml:space="preserve"> provide a new benchmark for studies of </w:t>
+      </w:r>
+      <w:proofErr w:type="spellStart"/>
+      <w:r>
+        <w:t>phylogeography</w:t>
+      </w:r>
+      <w:proofErr w:type="spellEnd"/>
+      <w:r>
+        <w:t xml:space="preserve"> and ecological adaptation</w:t>
+      </w:r>
+      <w:r>
+        <w:t xml:space="preserve"> in wild organisms</w:t>
+      </w:r>
+      <w:r>
+        <w:t>.</w:t>
+      </w:r>
+    </w:p>
+    <w:p>
       <w:pPr>
         <w:rPr>
           <w:i/>
         </w:rPr>
       </w:pPr>
-      <w:r>
-        <w:t>Please find enclosed our manuscript “</w:t>
+    </w:p>
+    <w:p>
+      <w:r>
+        <w:t>Our study is one the first haplotype map – or HapMap –</w:t>
+      </w:r>
+      <w:r>
+        <w:t xml:space="preserve"> </w:t>
+      </w:r>
+      <w:r>
+        <w:t xml:space="preserve">studies in a wild animal. </w:t>
+      </w:r>
+      <w:r>
+        <w:t xml:space="preserve">The human </w:t>
+      </w:r>
+      <w:r>
+        <w:t xml:space="preserve">HapMap </w:t>
+      </w:r>
+      <w:r>
+        <w:t xml:space="preserve">studies of </w:t>
+      </w:r>
+      <w:r>
+        <w:t xml:space="preserve">global </w:t>
+      </w:r>
+      <w:r>
+        <w:t>genomic variation revolutionised our understanding of human evolutionary history, and of the relationship</w:t>
+      </w:r>
+      <w:r>
+        <w:t xml:space="preserve"> between genotype and phenotype. Based on this ambitious project, a number of HapMap studies have been carried out on model species and species of agricultural or economic interest. However, large-scale, genomic studies of wild organisms are still scarce, despite the fact that such studies could enormously enhance our understanding of ecology and evolution.</w:t>
+      </w:r>
+    </w:p>
+    <w:p/>
+    <w:p>
+      <w:r>
+        <w:t xml:space="preserve">Great tits are </w:t>
+      </w:r>
+      <w:r>
+        <w:t>excellently suited to a HapMap study – they are one of</w:t>
+      </w:r>
+      <w:r>
+        <w:t xml:space="preserve"> the best known and widely </w:t>
+      </w:r>
+      <w:r>
+        <w:t xml:space="preserve">studied </w:t>
+      </w:r>
+      <w:r>
+        <w:t>wild animals</w:t>
+      </w:r>
+      <w:r>
+        <w:t>,</w:t>
+      </w:r>
+      <w:r>
+        <w:t xml:space="preserve"> with excellent ecological resources and data available from across their pan-European distribution. </w:t>
+      </w:r>
+      <w:r>
+        <w:t xml:space="preserve"> </w:t>
+      </w:r>
+      <w:r>
+        <w:t>By</w:t>
+      </w:r>
+      <w:r>
+        <w:t xml:space="preserve"> developing genomic resources for the great tit (Laine et al. 2016, </w:t>
       </w:r>
       <w:r>
         <w:rPr>
           <w:i/>
         </w:rPr>
-        <w:t>The great tit HapMap project: a continental-scale analysis of genomic variation in a songbird</w:t>
-      </w:r>
-      <w:r>
-        <w:t xml:space="preserve">”, which we hope you will consider for publication in </w:t>
+        <w:t xml:space="preserve">Nature </w:t>
       </w:r>
       <w:proofErr w:type="spellStart"/>
       <w:r>
         <w:rPr>
           <w:i/>
         </w:rPr>
+        <w:t>Comms</w:t>
+      </w:r>
+      <w:proofErr w:type="spellEnd"/>
+      <w:r>
+        <w:t xml:space="preserve">), </w:t>
+      </w:r>
+      <w:r>
+        <w:t>and combining this with ecological data, our recent research has significantly on this species enhanced our</w:t>
+      </w:r>
+      <w:r>
+        <w:t xml:space="preserve"> understanding of natural selection in the wild (Bosse et al. 2018, </w:t>
+      </w:r>
+      <w:r>
+        <w:rPr>
+          <w:i/>
+        </w:rPr>
+        <w:t>Science</w:t>
+      </w:r>
+      <w:r>
+        <w:t>).</w:t>
+      </w:r>
+    </w:p>
+    <w:p/>
+    <w:p>
+      <w:r>
+        <w:t xml:space="preserve">Utilising a panel of ~600,000 single nucleotide polymorphism markers, we screen genome-wide variation </w:t>
+      </w:r>
+      <w:r>
+        <w:t xml:space="preserve">across </w:t>
+      </w:r>
+      <w:commentRangeStart w:id="0"/>
+      <w:r>
+        <w:t xml:space="preserve">29 </w:t>
+      </w:r>
+      <w:commentRangeEnd w:id="0"/>
+      <w:r>
+        <w:rPr>
+          <w:rStyle w:val="CommentReference"/>
+        </w:rPr>
+        <w:commentReference w:id="0"/>
+      </w:r>
+      <w:r>
+        <w:t>populations, covering almost the entirety of Europe</w:t>
+      </w:r>
+      <w:r>
+        <w:t xml:space="preserve">. We </w:t>
+      </w:r>
+      <w:r>
+        <w:t>provid</w:t>
+      </w:r>
+      <w:r>
+        <w:t>e</w:t>
+      </w:r>
+      <w:r>
+        <w:t xml:space="preserve">, for the first time, clear evidence </w:t>
+      </w:r>
+      <w:r>
+        <w:t>of the colonisation history of this species</w:t>
+      </w:r>
+      <w:r>
+        <w:t xml:space="preserve">, and identify genetic structure among populations previously thought to be homogeneous. We then examine variation along the genome, and identify “islands of divergence”, where genetic structure is unusually high. Importantly, due to the large-scale nature of our study, we were </w:t>
+      </w:r>
+      <w:r>
+        <w:t>able to identify signatures of natural selection in specific populations, and show</w:t>
+      </w:r>
+      <w:bookmarkStart w:id="1" w:name="_GoBack"/>
+      <w:bookmarkEnd w:id="1"/>
+      <w:r>
+        <w:t>ed that this mainly occurred in peripheral populations, in regions containing candidate genes for climate adaptation and morphology.</w:t>
+      </w:r>
+    </w:p>
+    <w:p/>
+    <w:p>
+      <w:r>
+        <w:t>T</w:t>
+      </w:r>
+      <w:r>
+        <w:t>he</w:t>
+      </w:r>
+      <w:r>
+        <w:t xml:space="preserve"> large-scale</w:t>
+      </w:r>
+      <w:r>
+        <w:t xml:space="preserve"> data</w:t>
+      </w:r>
+      <w:r>
+        <w:t>set</w:t>
+      </w:r>
+      <w:r>
+        <w:t xml:space="preserve"> presented here will be made freely available, and represent</w:t>
+      </w:r>
+      <w:r>
+        <w:t>s</w:t>
+      </w:r>
+      <w:r>
+        <w:t xml:space="preserve"> an unprecedent resource for the scientific community</w:t>
+      </w:r>
+      <w:r>
+        <w:t xml:space="preserve">. As well as being of use to the large and growing research community studying the biology of great tits, our data will be of excellent value for testing new theories of colonisation, adaptation, and range expansion. They will also be of great interest for testing new methods for detecting selection from genomic data, environmental association analyses, and modelling population history. This, we are confident that the research and data presented here will be highly cited and influential. </w:t>
+      </w:r>
+    </w:p>
+    <w:p/>
+    <w:p>
+      <w:r>
+        <w:t xml:space="preserve">We hope you agree that our study is of high scientific importance, and suited to the readership of </w:t>
+      </w:r>
+      <w:proofErr w:type="spellStart"/>
+      <w:r>
+        <w:rPr>
+          <w:i/>
+        </w:rPr>
         <w:t>PLoS</w:t>
       </w:r>
       <w:proofErr w:type="spellEnd"/>
@@ -38,251 +295,38 @@
         <w:rPr>
           <w:i/>
         </w:rPr>
-        <w:t xml:space="preserve"> Biology.</w:t>
-      </w:r>
-      <w:r>
-        <w:rPr>
-          <w:i/>
-        </w:rPr>
-        <w:t xml:space="preserve"> </w:t>
-      </w:r>
-      <w:r>
-        <w:t xml:space="preserve">In this study we </w:t>
-      </w:r>
-      <w:r>
-        <w:t>perform one of the most comprehensive screens of genomic variation of any wild organism to date</w:t>
-      </w:r>
-      <w:r>
-        <w:t>,</w:t>
-      </w:r>
-      <w:r>
-        <w:t xml:space="preserve"> provid</w:t>
-      </w:r>
-      <w:r>
-        <w:t>ing</w:t>
-      </w:r>
-      <w:r>
-        <w:t xml:space="preserve"> new insights into how variation along the genome evolves in widespread continental species</w:t>
-      </w:r>
-      <w:r>
-        <w:t>.</w:t>
-      </w:r>
-      <w:r>
-        <w:t xml:space="preserve"> </w:t>
-      </w:r>
-      <w:r>
-        <w:t>In doing so, we</w:t>
-      </w:r>
-      <w:r>
-        <w:t xml:space="preserve"> provide a new benchmark for studies of </w:t>
-      </w:r>
-      <w:proofErr w:type="spellStart"/>
-      <w:r>
-        <w:t>phylogeography</w:t>
-      </w:r>
-      <w:proofErr w:type="spellEnd"/>
-      <w:r>
-        <w:t xml:space="preserve"> and ecological adaptation.</w:t>
+        <w:t xml:space="preserve"> Biology</w:t>
+      </w:r>
+      <w:r>
+        <w:t>. Should you choose to send our paper to review, we suggest the following reviewers, who are all experts in evolutionary biology and population genetics</w:t>
+      </w:r>
+      <w:r>
+        <w:t>:</w:t>
       </w:r>
     </w:p>
     <w:p>
       <w:pPr>
         <w:rPr>
-          <w:i/>
+          <w:rFonts w:ascii="Calibri" w:hAnsi="Calibri" w:cs="Calibri"/>
+          <w:color w:val="000000" w:themeColor="text1"/>
         </w:rPr>
       </w:pPr>
     </w:p>
     <w:p>
-      <w:r>
-        <w:t>The human haplotype map – or HapMap – studies of genomic variation across the globe revolutionised our understanding of human evolutionary history, and of the relationship</w:t>
-      </w:r>
-      <w:r>
-        <w:t xml:space="preserve"> between genotype and phenotype. Based on this ambitious project, a number of HapMap-style studies have been carried out on model species and species of agricultural or economic interest. However, large-scale, genomic studies of wild organisms are still scarce, despite the fact that such studies could enormously enhance our understanding of ecology and evolution.</w:t>
-      </w:r>
-    </w:p>
-    <w:p/>
-    <w:p>
-      <w:r>
-        <w:t xml:space="preserve">Great tits are </w:t>
-      </w:r>
-      <w:r>
-        <w:t>excellently suited to a HapMap study – they are one of</w:t>
-      </w:r>
-      <w:r>
-        <w:t xml:space="preserve"> the best known and widely </w:t>
-      </w:r>
-      <w:r>
-        <w:t xml:space="preserve">studied </w:t>
-      </w:r>
-      <w:r>
-        <w:t>wild animals</w:t>
-      </w:r>
-      <w:r>
-        <w:t>,</w:t>
-      </w:r>
-      <w:r>
-        <w:t xml:space="preserve"> and thanks to a rich history of research are considered an “ecological model species”. Authors of this paper have been instrumental in developing genomic resources for this </w:t>
-      </w:r>
-      <w:r>
-        <w:t>the great tit</w:t>
-      </w:r>
-      <w:r>
-        <w:t xml:space="preserve"> (Laine et al. 2016, </w:t>
-      </w:r>
-      <w:r>
-        <w:rPr>
-          <w:i/>
-        </w:rPr>
-        <w:t xml:space="preserve">Nature </w:t>
-      </w:r>
-      <w:proofErr w:type="spellStart"/>
-      <w:r>
-        <w:rPr>
-          <w:i/>
-        </w:rPr>
-        <w:t>Comms</w:t>
-      </w:r>
-      <w:proofErr w:type="spellEnd"/>
-      <w:r>
-        <w:t xml:space="preserve">), which we have combined with ecological data to </w:t>
-      </w:r>
-      <w:r>
-        <w:t>further our understanding of natural selection in the wild (</w:t>
-      </w:r>
-      <w:proofErr w:type="spellStart"/>
-      <w:r>
-        <w:t>Bosse</w:t>
-      </w:r>
-      <w:proofErr w:type="spellEnd"/>
-      <w:r>
-        <w:t xml:space="preserve"> et al. 2018, </w:t>
-      </w:r>
-      <w:r>
-        <w:rPr>
-          <w:i/>
-        </w:rPr>
-        <w:t>Science</w:t>
-      </w:r>
-      <w:r>
-        <w:t>).</w:t>
-      </w:r>
-    </w:p>
-    <w:p/>
-    <w:p>
-      <w:r>
-        <w:t xml:space="preserve">Utilising a recently developed panel of ~600,000 single nucleotide polymorphism markers, we screen genome-wide variation </w:t>
-      </w:r>
-      <w:r>
-        <w:t xml:space="preserve">across 29 populations, covering almost the entirety of Europe (see map below). </w:t>
-      </w:r>
-    </w:p>
-    <w:p/>
-    <w:p>
       <w:pPr>
-        <w:jc w:val="center"/>
+        <w:rPr>
+          <w:rFonts w:ascii="Calibri" w:hAnsi="Calibri" w:cs="Calibri"/>
+          <w:color w:val="000000" w:themeColor="text1"/>
+        </w:rPr>
       </w:pPr>
       <w:r>
-        <w:drawing>
-          <wp:inline distT="0" distB="0" distL="0" distR="0" wp14:anchorId="4E5304C6" wp14:editId="61EAF4F9">
-            <wp:extent cx="3343911" cy="2608028"/>
-            <wp:effectExtent l="0" t="0" r="0" b="0"/>
-            <wp:docPr id="1" name="Picture 1"/>
-            <wp:cNvGraphicFramePr>
-              <a:graphicFrameLocks xmlns:a="http://schemas.openxmlformats.org/drawingml/2006/main" noChangeAspect="1"/>
-            </wp:cNvGraphicFramePr>
-            <a:graphic xmlns:a="http://schemas.openxmlformats.org/drawingml/2006/main">
-              <a:graphicData uri="http://schemas.openxmlformats.org/drawingml/2006/picture">
-                <pic:pic xmlns:pic="http://schemas.openxmlformats.org/drawingml/2006/picture">
-                  <pic:nvPicPr>
-                    <pic:cNvPr id="1" name=""/>
-                    <pic:cNvPicPr/>
-                  </pic:nvPicPr>
-                  <pic:blipFill>
-                    <a:blip r:embed="rId4"/>
-                    <a:stretch>
-                      <a:fillRect/>
-                    </a:stretch>
-                  </pic:blipFill>
-                  <pic:spPr>
-                    <a:xfrm>
-                      <a:off x="0" y="0"/>
-                      <a:ext cx="3363875" cy="2623598"/>
-                    </a:xfrm>
-                    <a:prstGeom prst="rect">
-                      <a:avLst/>
-                    </a:prstGeom>
-                  </pic:spPr>
-                </pic:pic>
-              </a:graphicData>
-            </a:graphic>
-          </wp:inline>
-        </w:drawing>
-      </w:r>
-    </w:p>
-    <w:p/>
-    <w:p>
-      <w:r>
-        <w:t>Using these data w</w:t>
-      </w:r>
-      <w:bookmarkStart w:id="0" w:name="_GoBack"/>
-      <w:bookmarkEnd w:id="0"/>
-      <w:r>
-        <w:t xml:space="preserve">e provide, for the first time, clear evidence that great tits colonised Europe from a single refugium in the East, and identify clear patterns among of genetic structure among populations previously thought to be homogeneous. We then examine variation along the genome, and identify “islands of divergence”, where genetic structure is </w:t>
-      </w:r>
-      <w:r>
-        <w:lastRenderedPageBreak/>
-        <w:t>unusually high. Importantly, due to the large-scale nature of our study, we were where and why these genomic islands arise</w:t>
-      </w:r>
-      <w:r>
-        <w:t>, showing that while some islands arise to features of the genome, others are the product of recent natural selection.</w:t>
-      </w:r>
-      <w:r>
-        <w:t xml:space="preserve"> </w:t>
-      </w:r>
-    </w:p>
-    <w:p/>
-    <w:p>
-      <w:pPr>
-        <w:jc w:val="center"/>
-      </w:pPr>
-    </w:p>
-    <w:p/>
-    <w:p>
-      <w:r>
-        <w:t xml:space="preserve">We hope you agree that our study is of high scientific importance, and suited to the readership of </w:t>
-      </w:r>
-      <w:proofErr w:type="spellStart"/>
-      <w:r>
-        <w:t>PLoS</w:t>
-      </w:r>
-      <w:proofErr w:type="spellEnd"/>
-      <w:r>
-        <w:t xml:space="preserve"> Biology. Should you choose to send our paper to review, we suggest the following reviewers, who are all experts in evolutionary biology and population genetics</w:t>
-      </w:r>
-    </w:p>
-    <w:p>
-      <w:pPr>
-        <w:rPr>
-          <w:rFonts w:ascii="Calibri" w:hAnsi="Calibri" w:cs="Calibri"/>
-          <w:color w:val="000000" w:themeColor="text1"/>
-        </w:rPr>
-      </w:pPr>
-    </w:p>
-    <w:p>
-      <w:pPr>
-        <w:rPr>
-          <w:rFonts w:ascii="Calibri" w:hAnsi="Calibri" w:cs="Calibri"/>
-          <w:color w:val="000000" w:themeColor="text1"/>
-        </w:rPr>
-      </w:pPr>
-      <w:r>
         <w:rPr>
           <w:rFonts w:ascii="Calibri" w:hAnsi="Calibri" w:cs="Calibri"/>
           <w:color w:val="000000" w:themeColor="text1"/>
         </w:rPr>
         <w:t xml:space="preserve">Dr Sonya Clegg, University of Oxford - </w:t>
       </w:r>
-      <w:hyperlink r:id="rId5" w:history="1">
+      <w:hyperlink r:id="rId7" w:history="1">
         <w:r>
           <w:rPr>
             <w:rStyle w:val="Hyperlink"/>
@@ -311,6 +355,7 @@
           <w:rFonts w:ascii="Calibri" w:hAnsi="Calibri" w:cs="Calibri"/>
           <w:color w:val="000000" w:themeColor="text1"/>
         </w:rPr>
+        <w:lastRenderedPageBreak/>
         <w:t xml:space="preserve">Prof Chris </w:t>
       </w:r>
       <w:proofErr w:type="spellStart"/>
@@ -329,7 +374,7 @@
         </w:rPr>
         <w:t xml:space="preserve">, University of Cambridge - </w:t>
       </w:r>
-      <w:hyperlink r:id="rId6" w:history="1">
+      <w:hyperlink r:id="rId8" w:history="1">
         <w:r>
           <w:rPr>
             <w:rStyle w:val="Hyperlink"/>
@@ -376,7 +421,7 @@
         </w:rPr>
         <w:t xml:space="preserve">, Colorado State University - </w:t>
       </w:r>
-      <w:hyperlink r:id="rId7" w:history="1">
+      <w:hyperlink r:id="rId9" w:history="1">
         <w:r>
           <w:rPr>
             <w:rStyle w:val="Hyperlink"/>
@@ -439,7 +484,7 @@
         </w:rPr>
         <w:t xml:space="preserve">, University of Jena - </w:t>
       </w:r>
-      <w:hyperlink r:id="rId8" w:history="1">
+      <w:hyperlink r:id="rId10" w:history="1">
         <w:r>
           <w:rPr>
             <w:rStyle w:val="Hyperlink"/>
@@ -463,7 +508,7 @@
         </w:rPr>
         <w:t xml:space="preserve">Dr Kathryn Elmer, University of Glasgow - </w:t>
       </w:r>
-      <w:hyperlink r:id="rId9" w:history="1">
+      <w:hyperlink r:id="rId11" w:history="1">
         <w:r>
           <w:rPr>
             <w:rStyle w:val="Hyperlink"/>
@@ -510,7 +555,7 @@
         </w:rPr>
         <w:t xml:space="preserve">, University of Calgary - </w:t>
       </w:r>
-      <w:hyperlink r:id="rId10" w:history="1">
+      <w:hyperlink r:id="rId12" w:history="1">
         <w:r>
           <w:rPr>
             <w:rStyle w:val="Hyperlink"/>
@@ -597,6 +642,39 @@
     </w:sectPr>
   </w:body>
 </w:document>
+</file>
+
+<file path=word/comments.xml><?xml version="1.0" encoding="utf-8"?>
+<w:comments xmlns:wpc="http://schemas.microsoft.com/office/word/2010/wordprocessingCanvas" xmlns:cx="http://schemas.microsoft.com/office/drawing/2014/chartex" xmlns:cx1="http://schemas.microsoft.com/office/drawing/2015/9/8/chartex" xmlns:cx2="http://schemas.microsoft.com/office/drawing/2015/10/21/chartex" xmlns:cx3="http://schemas.microsoft.com/office/drawing/2016/5/9/chartex" xmlns:cx4="http://schemas.microsoft.com/office/drawing/2016/5/10/chartex" xmlns:cx5="http://schemas.microsoft.com/office/drawing/2016/5/11/chartex" xmlns:cx6="http://schemas.microsoft.com/office/drawing/2016/5/12/chartex" xmlns:cx7="http://schemas.microsoft.com/office/drawing/2016/5/13/chartex" xmlns:cx8="http://schemas.microsoft.com/office/drawing/2016/5/14/chartex" xmlns:mc="http://schemas.openxmlformats.org/markup-compatibility/2006" xmlns:aink="http://schemas.microsoft.com/office/drawing/2016/ink" xmlns:am3d="http://schemas.microsoft.com/office/drawing/2017/model3d" xmlns:o="urn:schemas-microsoft-com:office:office" xmlns:r="http://schemas.openxmlformats.org/officeDocument/2006/relationships" xmlns:m="http://schemas.openxmlformats.org/officeDocument/2006/math" xmlns:v="urn:schemas-microsoft-com:vml" xmlns:wp14="http://schemas.microsoft.com/office/word/2010/wordprocessingDrawing" xmlns:wp="http://schemas.openxmlformats.org/drawingml/2006/wordprocessingDrawing" xmlns:w10="urn:schemas-microsoft-com:office:word" xmlns:w="http://schemas.openxmlformats.org/wordprocessingml/2006/main" xmlns:w14="http://schemas.microsoft.com/office/word/2010/wordml" xmlns:w15="http://schemas.microsoft.com/office/word/2012/wordml" xmlns:w16cid="http://schemas.microsoft.com/office/word/2016/wordml/cid" xmlns:w16se="http://schemas.microsoft.com/office/word/2015/wordml/symex" xmlns:wpg="http://schemas.microsoft.com/office/word/2010/wordprocessingGroup" xmlns:wpi="http://schemas.microsoft.com/office/word/2010/wordprocessingInk" xmlns:wne="http://schemas.microsoft.com/office/word/2006/wordml" xmlns:wps="http://schemas.microsoft.com/office/word/2010/wordprocessingShape" mc:Ignorable="w14 w15 w16se w16cid wp14">
+  <w:comment w:id="0" w:author="L" w:date="2019-02-10T21:11:00Z" w:initials="L">
+    <w:p>
+      <w:pPr>
+        <w:pStyle w:val="CommentText"/>
+      </w:pPr>
+      <w:r>
+        <w:rPr>
+          <w:rStyle w:val="CommentReference"/>
+        </w:rPr>
+        <w:annotationRef/>
+      </w:r>
+      <w:r>
+        <w:t>Add figure 1 map to cover letter?</w:t>
+      </w:r>
+    </w:p>
+  </w:comment>
+</w:comments>
+</file>
+
+<file path=word/commentsExtended.xml><?xml version="1.0" encoding="utf-8"?>
+<w15:commentsEx xmlns:wpc="http://schemas.microsoft.com/office/word/2010/wordprocessingCanvas" xmlns:cx="http://schemas.microsoft.com/office/drawing/2014/chartex" xmlns:cx1="http://schemas.microsoft.com/office/drawing/2015/9/8/chartex" xmlns:cx2="http://schemas.microsoft.com/office/drawing/2015/10/21/chartex" xmlns:cx3="http://schemas.microsoft.com/office/drawing/2016/5/9/chartex" xmlns:cx4="http://schemas.microsoft.com/office/drawing/2016/5/10/chartex" xmlns:cx5="http://schemas.microsoft.com/office/drawing/2016/5/11/chartex" xmlns:cx6="http://schemas.microsoft.com/office/drawing/2016/5/12/chartex" xmlns:cx7="http://schemas.microsoft.com/office/drawing/2016/5/13/chartex" xmlns:cx8="http://schemas.microsoft.com/office/drawing/2016/5/14/chartex" xmlns:mc="http://schemas.openxmlformats.org/markup-compatibility/2006" xmlns:aink="http://schemas.microsoft.com/office/drawing/2016/ink" xmlns:am3d="http://schemas.microsoft.com/office/drawing/2017/model3d" xmlns:o="urn:schemas-microsoft-com:office:office" xmlns:r="http://schemas.openxmlformats.org/officeDocument/2006/relationships" xmlns:m="http://schemas.openxmlformats.org/officeDocument/2006/math" xmlns:v="urn:schemas-microsoft-com:vml" xmlns:wp14="http://schemas.microsoft.com/office/word/2010/wordprocessingDrawing" xmlns:wp="http://schemas.openxmlformats.org/drawingml/2006/wordprocessingDrawing" xmlns:w10="urn:schemas-microsoft-com:office:word" xmlns:w="http://schemas.openxmlformats.org/wordprocessingml/2006/main" xmlns:w14="http://schemas.microsoft.com/office/word/2010/wordml" xmlns:w15="http://schemas.microsoft.com/office/word/2012/wordml" xmlns:w16cid="http://schemas.microsoft.com/office/word/2016/wordml/cid" xmlns:w16se="http://schemas.microsoft.com/office/word/2015/wordml/symex" xmlns:wpg="http://schemas.microsoft.com/office/word/2010/wordprocessingGroup" xmlns:wpi="http://schemas.microsoft.com/office/word/2010/wordprocessingInk" xmlns:wne="http://schemas.microsoft.com/office/word/2006/wordml" xmlns:wps="http://schemas.microsoft.com/office/word/2010/wordprocessingShape" mc:Ignorable="w14 w15 w16se w16cid wp14">
+  <w15:commentEx w15:paraId="409A57A5" w15:done="0"/>
+</w15:commentsEx>
+</file>
+
+<file path=word/commentsIds.xml><?xml version="1.0" encoding="utf-8"?>
+<w16cid:commentsIds xmlns:wpc="http://schemas.microsoft.com/office/word/2010/wordprocessingCanvas" xmlns:cx="http://schemas.microsoft.com/office/drawing/2014/chartex" xmlns:cx1="http://schemas.microsoft.com/office/drawing/2015/9/8/chartex" xmlns:cx2="http://schemas.microsoft.com/office/drawing/2015/10/21/chartex" xmlns:cx3="http://schemas.microsoft.com/office/drawing/2016/5/9/chartex" xmlns:cx4="http://schemas.microsoft.com/office/drawing/2016/5/10/chartex" xmlns:cx5="http://schemas.microsoft.com/office/drawing/2016/5/11/chartex" xmlns:cx6="http://schemas.microsoft.com/office/drawing/2016/5/12/chartex" xmlns:cx7="http://schemas.microsoft.com/office/drawing/2016/5/13/chartex" xmlns:cx8="http://schemas.microsoft.com/office/drawing/2016/5/14/chartex" xmlns:mc="http://schemas.openxmlformats.org/markup-compatibility/2006" xmlns:aink="http://schemas.microsoft.com/office/drawing/2016/ink" xmlns:am3d="http://schemas.microsoft.com/office/drawing/2017/model3d" xmlns:o="urn:schemas-microsoft-com:office:office" xmlns:r="http://schemas.openxmlformats.org/officeDocument/2006/relationships" xmlns:m="http://schemas.openxmlformats.org/officeDocument/2006/math" xmlns:v="urn:schemas-microsoft-com:vml" xmlns:wp14="http://schemas.microsoft.com/office/word/2010/wordprocessingDrawing" xmlns:wp="http://schemas.openxmlformats.org/drawingml/2006/wordprocessingDrawing" xmlns:w10="urn:schemas-microsoft-com:office:word" xmlns:w="http://schemas.openxmlformats.org/wordprocessingml/2006/main" xmlns:w14="http://schemas.microsoft.com/office/word/2010/wordml" xmlns:w15="http://schemas.microsoft.com/office/word/2012/wordml" xmlns:w16cid="http://schemas.microsoft.com/office/word/2016/wordml/cid" xmlns:w16se="http://schemas.microsoft.com/office/word/2015/wordml/symex" xmlns:wpg="http://schemas.microsoft.com/office/word/2010/wordprocessingGroup" xmlns:wpi="http://schemas.microsoft.com/office/word/2010/wordprocessingInk" xmlns:wne="http://schemas.microsoft.com/office/word/2006/wordml" xmlns:wps="http://schemas.microsoft.com/office/word/2010/wordprocessingShape" mc:Ignorable="w14 w15 w16se w16cid wp14">
+  <w16cid:commentId w16cid:paraId="409A57A5" w16cid:durableId="200B11F3"/>
+</w16cid:commentsIds>
 </file>
 
 <file path=word/styles.xml><?xml version="1.0" encoding="utf-8"?>
@@ -1042,6 +1120,101 @@
       <w:shd w:val="clear" w:color="auto" w:fill="E1DFDD"/>
     </w:rPr>
   </w:style>
+  <w:style w:type="character" w:styleId="CommentReference">
+    <w:name w:val="annotation reference"/>
+    <w:basedOn w:val="DefaultParagraphFont"/>
+    <w:uiPriority w:val="99"/>
+    <w:semiHidden/>
+    <w:unhideWhenUsed/>
+    <w:rsid w:val="00CF5A4E"/>
+    <w:rPr>
+      <w:sz w:val="16"/>
+      <w:szCs w:val="16"/>
+    </w:rPr>
+  </w:style>
+  <w:style w:type="paragraph" w:styleId="CommentText">
+    <w:name w:val="annotation text"/>
+    <w:basedOn w:val="Normal"/>
+    <w:link w:val="CommentTextChar"/>
+    <w:uiPriority w:val="99"/>
+    <w:semiHidden/>
+    <w:unhideWhenUsed/>
+    <w:rsid w:val="00CF5A4E"/>
+    <w:rPr>
+      <w:sz w:val="20"/>
+      <w:szCs w:val="20"/>
+    </w:rPr>
+  </w:style>
+  <w:style w:type="character" w:customStyle="1" w:styleId="CommentTextChar">
+    <w:name w:val="Comment Text Char"/>
+    <w:basedOn w:val="DefaultParagraphFont"/>
+    <w:link w:val="CommentText"/>
+    <w:uiPriority w:val="99"/>
+    <w:semiHidden/>
+    <w:rsid w:val="00CF5A4E"/>
+    <w:rPr>
+      <w:sz w:val="20"/>
+      <w:szCs w:val="20"/>
+      <w:lang w:val="en-GB"/>
+    </w:rPr>
+  </w:style>
+  <w:style w:type="paragraph" w:styleId="CommentSubject">
+    <w:name w:val="annotation subject"/>
+    <w:basedOn w:val="CommentText"/>
+    <w:next w:val="CommentText"/>
+    <w:link w:val="CommentSubjectChar"/>
+    <w:uiPriority w:val="99"/>
+    <w:semiHidden/>
+    <w:unhideWhenUsed/>
+    <w:rsid w:val="00CF5A4E"/>
+    <w:rPr>
+      <w:b/>
+      <w:bCs/>
+    </w:rPr>
+  </w:style>
+  <w:style w:type="character" w:customStyle="1" w:styleId="CommentSubjectChar">
+    <w:name w:val="Comment Subject Char"/>
+    <w:basedOn w:val="CommentTextChar"/>
+    <w:link w:val="CommentSubject"/>
+    <w:uiPriority w:val="99"/>
+    <w:semiHidden/>
+    <w:rsid w:val="00CF5A4E"/>
+    <w:rPr>
+      <w:b/>
+      <w:bCs/>
+      <w:sz w:val="20"/>
+      <w:szCs w:val="20"/>
+      <w:lang w:val="en-GB"/>
+    </w:rPr>
+  </w:style>
+  <w:style w:type="paragraph" w:styleId="BalloonText">
+    <w:name w:val="Balloon Text"/>
+    <w:basedOn w:val="Normal"/>
+    <w:link w:val="BalloonTextChar"/>
+    <w:uiPriority w:val="99"/>
+    <w:semiHidden/>
+    <w:unhideWhenUsed/>
+    <w:rsid w:val="00CF5A4E"/>
+    <w:rPr>
+      <w:rFonts w:ascii="Times New Roman" w:hAnsi="Times New Roman" w:cs="Times New Roman"/>
+      <w:sz w:val="18"/>
+      <w:szCs w:val="18"/>
+    </w:rPr>
+  </w:style>
+  <w:style w:type="character" w:customStyle="1" w:styleId="BalloonTextChar">
+    <w:name w:val="Balloon Text Char"/>
+    <w:basedOn w:val="DefaultParagraphFont"/>
+    <w:link w:val="BalloonText"/>
+    <w:uiPriority w:val="99"/>
+    <w:semiHidden/>
+    <w:rsid w:val="00CF5A4E"/>
+    <w:rPr>
+      <w:rFonts w:ascii="Times New Roman" w:hAnsi="Times New Roman" w:cs="Times New Roman"/>
+      <w:sz w:val="18"/>
+      <w:szCs w:val="18"/>
+      <w:lang w:val="en-GB"/>
+    </w:rPr>
+  </w:style>
 </w:styles>
 </file>
 

</xml_diff>